<commit_message>
Deploying to gh-pages from @ Morrison-Lab/rme@44919ff34373083a2760a591511e33bf5ed55fcb 🚀
</commit_message>
<xml_diff>
--- a/chapters/CONTRIBUTING.docx
+++ b/chapters/CONTRIBUTING.docx
@@ -354,7 +354,13 @@
         </w:numPr>
       </w:pPr>
       <w:r>
-        <w:t xml:space="preserve">Fork the package and clone onto your computer. If you haven’t done this before, we recommend using</w:t>
+        <w:t xml:space="preserve">Fork the package and clone onto your computer.</w:t>
+      </w:r>
+      <w:r>
+        <w:t xml:space="preserve"> </w:t>
+      </w:r>
+      <w:r>
+        <w:t xml:space="preserve">If you haven’t done this before, we recommend using</w:t>
       </w:r>
       <w:r>
         <w:t xml:space="preserve"> </w:t>
@@ -363,7 +369,7 @@
         <w:rPr>
           <w:rStyle w:val="VerbatimChar"/>
         </w:rPr>
-        <w:t xml:space="preserve">usethis::create_from_github("d-morrison/rme", fork = TRUE)</w:t>
+        <w:t xml:space="preserve">usethis::create_from_github("Morrison-Lab/rme", fork = TRUE)</w:t>
       </w:r>
       <w:r>
         <w:t xml:space="preserve">.</w:t>

</xml_diff>